<commit_message>
R4/R5: consistency fixes from checker panel (Table 1 refs, line ranges, tone), bnae C3 row, implemented-phrasing responses, final revision zip
</commit_message>
<xml_diff>
--- a/revision/Responses_to_Reviewers.docx
+++ b/revision/Responses_to_Reviewers.docx
@@ -189,7 +189,7 @@
               <w:pStyle w:val="Compact"/>
             </w:pPr>
             <w:r>
-              <w:t xml:space="preserve">We sincerely thank the reviewer for this generous assessment and for recommending the paper for Findings. We have worked to preserve these strengths while tightening the scope as suggested below.</w:t>
+              <w:t xml:space="preserve">We sincerely thank the reviewer for this generous assessment. We have worked to preserve these strengths while tightening the scope as suggested below.</w:t>
             </w:r>
           </w:p>
         </w:tc>
@@ -228,7 +228,7 @@
               <w:pStyle w:val="Compact"/>
             </w:pPr>
             <w:r>
-              <w:t xml:space="preserve">We fully agree, and we apologize for the imprecision. This comment is addressed as follows: the broad definition is replaced by two explicit inclusion criteria, (i) the linguistic structure of the feedback must be functionally consumed rather than collapsed to a scalar or preference bit before use, and (ii) the feedback must participate in an improvement loop (Section 1, page 2, lines 74–88). The same passage now states what does</w:t>
+              <w:t xml:space="preserve">We fully agree, and we apologize for the imprecision. This comment is addressed as follows: the broad definition is replaced by two explicit inclusion criteria, (i) the linguistic structure of the feedback must be functionally consumed rather than collapsed to a scalar or preference bit before use, and (ii) the feedback must participate in an improvement loop (Section 1, page 2, lines 76–95). The same passage now states what does</w:t>
             </w:r>
             <w:r>
               <w:t xml:space="preserve"> </w:t>
@@ -244,7 +244,7 @@
               <w:t xml:space="preserve"> </w:t>
             </w:r>
             <w:r>
-              <w:t xml:space="preserve">count as VRL: plain instruction following (no improvement loop), vanilla RLHF/DPO (judgment reduced to a preference bit before learning; retained only as the scalar endpoint of the compression spectrum, see also Section 5.4, page 8, lines 637–641), and language-conditioned RL (language as policy input, not feedback). A boundary clarification for specification-time consumption appears at page 2, lines 92–97, and the abstract now announces the criteria (page 1, lines 7–10).</w:t>
+              <w:t xml:space="preserve">count as VRL: plain instruction following (no improvement loop), vanilla RLHF/DPO (judgment reduced to a preference bit before learning; retained only as the scalar endpoint of the compression spectrum, see also Section 5.4, page 8, lines 637–641), and language-conditioned RL (language as policy input, not feedback). A boundary clarification for specification-time consumption appears at page 2, lines 95–99, and the abstract now announces the criteria (page 1, lines 8–11).</w:t>
             </w:r>
           </w:p>
         </w:tc>
@@ -295,7 +295,7 @@
               <w:t xml:space="preserve"> </w:t>
             </w:r>
             <w:r>
-              <w:t xml:space="preserve">(page 4, lines 239–244), and a new hybrid-cases table (Table 2, page 4, lines 249–252) records primary placements together with secondary roles instead of forcing single-cell membership. For the two cases the reviewer names: reward-code generation now carries the specification-time rationale and an explicit pointer to its downstream training role (Section 3.4, page 5, lines 379–384), and experiential memory is now classified by its moment of consumption with the cross-episode boundary recorded (Section 4.4, page 7, lines 480–485).</w:t>
+              <w:t xml:space="preserve">(page 4, lines 239–244), and a new hybrid-cases table (Table 1, page 4) records primary placements together with secondary roles instead of forcing single-cell membership. For the two cases the reviewer names: reward-code generation now carries the specification-time rationale and an explicit pointer to its downstream training role (Section 3.4, page 5, lines 379–384), and experiential memory is now classified by its moment of consumption with the cross-episode boundary recorded (Section 4.4, page 7, lines 481–486).</w:t>
             </w:r>
           </w:p>
         </w:tc>
@@ -404,7 +404,10 @@
               <w:t xml:space="preserve">“grounded signal”</w:t>
             </w:r>
             <w:r>
-              <w:t xml:space="preserve">. We are additionally re-exporting the figures to ensure the embedded labels match the standardized term.</w:t>
+              <w:t xml:space="preserve"> </w:t>
+            </w:r>
+            <w:r>
+              <w:t xml:space="preserve">(the term now appears uniformly, e.g., Section 2 pillar definitions, page 3, and Section 3 throughout). We are additionally re-exporting the figures to ensure the embedded labels match the standardized term.</w:t>
             </w:r>
           </w:p>
         </w:tc>
@@ -443,7 +446,7 @@
               <w:pStyle w:val="Compact"/>
             </w:pPr>
             <w:r>
-              <w:t xml:space="preserve">We agree and thank the reviewer for the concrete framing. This comment is addressed in the expanded Limitations section (page 10, lines 827–832), which now names the failure modes (incorrect, biased, adversarial, or poorly grounded feedback) and discusses who is harmed in the high-stakes deployments the reviewer lists, complementing the existing Section 6 discussion of prompt injection, memory poisoning, and sycophancy.</w:t>
+              <w:t xml:space="preserve">We agree and thank the reviewer for the concrete framing. This comment is addressed in the expanded Limitations section (page 10, lines 830–843), which now names the failure modes (incorrect, biased, adversarial, or poorly grounded feedback) and discusses who is harmed in the high-stakes deployments the reviewer lists, complementing the existing Section 6 discussion of prompt injection, memory poisoning, and sycophancy.</w:t>
             </w:r>
           </w:p>
         </w:tc>
@@ -543,7 +546,7 @@
               <w:pStyle w:val="Compact"/>
             </w:pPr>
             <w:r>
-              <w:t xml:space="preserve">We sincerely thank the reviewer for finding the direction exciting and for the unusually actionable critique; the revision below follows it closely.</w:t>
+              <w:t xml:space="preserve">We sincerely thank the reviewer for finding the direction exciting and for the detailed, actionable critique; the revision below follows it closely.</w:t>
             </w:r>
           </w:p>
         </w:tc>
@@ -582,7 +585,7 @@
               <w:pStyle w:val="Compact"/>
             </w:pPr>
             <w:r>
-              <w:t xml:space="preserve">We agree, and we are sorry the original framing invited this reading. This comment is addressed as follows: the definition is replaced by two inclusion criteria (Section 1, page 2, lines 74–88) under which supervised fine-tuning on instructions and vanilla RLHF/DPO fall</w:t>
+              <w:t xml:space="preserve">We agree, and we are sorry the original framing invited this reading. This comment is addressed as follows: the definition is replaced by two inclusion criteria (Section 1, page 2, lines 76–95) under which supervised fine-tuning on instructions and vanilla RLHF/DPO fall</w:t>
             </w:r>
             <w:r>
               <w:t xml:space="preserve"> </w:t>
@@ -688,7 +691,7 @@
               <w:t xml:space="preserve"> </w:t>
             </w:r>
             <w:r>
-              <w:t xml:space="preserve">(Section 2, page 4, lines 254–259). The coding-agent example is reframed accordingly, as a system in which signals of all three kinds coexist.</w:t>
+              <w:t xml:space="preserve">(Section 2, page 4, lines 256–260). The coding-agent example is reframed accordingly, as a system in which signals of all three kinds coexist.</w:t>
             </w:r>
           </w:p>
         </w:tc>
@@ -766,7 +769,7 @@
               <w:pStyle w:val="Compact"/>
             </w:pPr>
             <w:r>
-              <w:t xml:space="preserve">We agree in part, and we have clarified our intent. This comment is addressed by an explicit caveat in Section 2: MDP vocabulary serves as an organizing lens rather than a claim that every method admits an MDP formulation; many settings are partially observable, non-Markovian, or lack explicit transition and reward functions (page 4, lines 244–249).</w:t>
+              <w:t xml:space="preserve">We agree in part, and we have clarified our intent. This comment is addressed by an explicit caveat in Section 2: MDP vocabulary serves as an organizing lens rather than a claim that every method admits an MDP formulation; many settings are partially observable, non-Markovian, or lack explicit transition and reward functions (page 4, lines 246–252).</w:t>
             </w:r>
           </w:p>
         </w:tc>
@@ -856,7 +859,7 @@
               <w:pStyle w:val="Compact"/>
             </w:pPr>
             <w:r>
-              <w:t xml:space="preserve">We agree. This comment is addressed in three places: (a) a new evaluation-practice discussion recommending that feedback quality and feedback utilization be reported separately, with the relevant benchmarks (Section 6.2, page 9, lines 692–697); (b) a new practitioner decision table stating when each verbal-feedback mechanism is the right choice (Appendix B, Table 4, page 19); and (c) a named research agenda (Section 6.5, page 10, within lines 775–828). Constructing a new benchmark is beyond a survey’s scope, but we believe the comparison framework and decision guidance directly address the comparability gap.</w:t>
+              <w:t xml:space="preserve">We agree. This comment is addressed in three places: (a) a new evaluation-practice discussion recommending that feedback quality and feedback utilization be reported separately, with the relevant benchmarks (Section 6.2, page 9, lines 692–697); (b) a new practitioner decision table stating when each verbal-feedback mechanism is the right choice (Appendix B, Table 4, page 19); and (c) a named research agenda (Section 6.5, page 10, lines 777–787). Constructing a new benchmark is beyond a survey’s scope, but we believe the comparison framework and decision guidance directly address the comparability gap.</w:t>
             </w:r>
           </w:p>
         </w:tc>
@@ -962,7 +965,7 @@
               <w:pStyle w:val="Compact"/>
             </w:pPr>
             <w:r>
-              <w:t xml:space="preserve">Addressed together with W1 and W4: exclusions are now stated explicitly in Section 1 (page 2, lines 83–88), including instruction following, vanilla RLHF/DPO, and language-conditioned RL.</w:t>
+              <w:t xml:space="preserve">Addressed together with W1 and W4: exclusions are now stated explicitly in Section 1 (page 2, lines 85–95), including instruction following, vanilla RLHF/DPO, and language-conditioned RL.</w:t>
             </w:r>
           </w:p>
         </w:tc>
@@ -1101,7 +1104,7 @@
               <w:pStyle w:val="Compact"/>
             </w:pPr>
             <w:r>
-              <w:t xml:space="preserve">We agree, and we apologize for the omission. This comment is addressed as follows: the introduction now positions the survey against prior overviews with citations (Section 1, page 3, lines 149–151), and a new comparison table covers twelve surveys and frameworks with columns for organizing axis, feedback types, lifecycle stages, and practitioner guidance (Appendix A, Table 3, page 18). The accompanying text states our differentiation: prior surveys organize by mechanism or agent capability, ours by the signal itself.</w:t>
+              <w:t xml:space="preserve">We agree, and we apologize for the omission. This comment is addressed as follows: the introduction now positions the survey against prior overviews with citations (Section 1, page 3, lines 146–165), and a new comparison table covers twelve surveys and frameworks with columns for organizing axis, feedback types, lifecycle stages, and practitioner guidance (Appendix A, Table 3, page 18). The accompanying text states our differentiation: prior surveys organize by mechanism or agent capability, ours by the signal itself.</w:t>
             </w:r>
           </w:p>
         </w:tc>
@@ -1140,7 +1143,7 @@
               <w:pStyle w:val="Compact"/>
             </w:pPr>
             <w:r>
-              <w:t xml:space="preserve">This comment is addressed by making the taxonomy operational: an explicit assignment rule (Section 2, page 4, lines 239–244), a hybrid-cases table showing the rule applied (Table 2, page 4), and a new contribution bullet committing the paper to applicability rather than description (Section 1, page 3, within lines 188–236).</w:t>
+              <w:t xml:space="preserve">This comment is addressed by making the taxonomy operational: an explicit assignment rule (Section 2, page 4, lines 239–244), a hybrid-cases table showing the rule applied (Table 1, page 4), and a new contribution bullet committing the paper to applicability rather than description (Section 1, page 3, within lines 188–236).</w:t>
             </w:r>
           </w:p>
         </w:tc>
@@ -1347,7 +1350,7 @@
               <w:pStyle w:val="Compact"/>
             </w:pPr>
             <w:r>
-              <w:t xml:space="preserve">We agree and have chosen to state the scope precisely: the feedback signal is natural-language text, while the agent’s observations may be non-textual, as in embodied settings (Section 1, page 2, lines 96–101). A fuller treatment of embodied and multimodal settings is planned for an extended version.</w:t>
+              <w:t xml:space="preserve">We agree and have chosen to state the scope precisely: the feedback signal is natural-language text, while the agent’s observations may be non-textual, as in embodied settings (Section 1, page 2, lines 99–104). A fuller treatment of embodied and multimodal settings is planned for an extended version.</w:t>
             </w:r>
           </w:p>
         </w:tc>
@@ -1386,7 +1389,7 @@
               <w:pStyle w:val="Compact"/>
             </w:pPr>
             <w:r>
-              <w:t xml:space="preserve">We thank the reviewer for the precise list. This comment is addressed in the expanded Limitations section, which now names all four failure modes verbatim and connects them to the mitigation discussions in Section 6 (page 10, lines 827–832).</w:t>
+              <w:t xml:space="preserve">We thank the reviewer for the precise list. This comment is addressed in the expanded Limitations section, which now names all four failure modes verbatim and connects them to the mitigation discussions in Section 6 (page 10, lines 830–843).</w:t>
             </w:r>
           </w:p>
         </w:tc>
@@ -1564,7 +1567,7 @@
               <w:pStyle w:val="Compact"/>
             </w:pPr>
             <w:r>
-              <w:t xml:space="preserve">We agree this was missing. This comment is addressed by (a) the research agenda in Section 6.5, which names five open problems, sample-efficiency conditions, optimality under language-shaped rewards, credit assignment from critiques, feedback provenance and robustness, and standardized evaluation (page 10, within lines 775–828), and (b) the practitioner decision table, which turns the taxonomy into design guidance (Appendix B, Table 4, page 19).</w:t>
+              <w:t xml:space="preserve">We agree this was missing. This comment is addressed by (a) the research agenda in Section 6.5, which names five open problems, sample-efficiency conditions, optimality under language-shaped rewards, credit assignment from critiques, feedback provenance and robustness, and standardized evaluation (page 10, lines 777–787), and (b) the practitioner decision table, which turns the taxonomy into design guidance (Appendix B, Table 4, page 19).</w:t>
             </w:r>
           </w:p>
         </w:tc>
@@ -1603,7 +1606,7 @@
               <w:pStyle w:val="Compact"/>
             </w:pPr>
             <w:r>
-              <w:t xml:space="preserve">We agree. This comment is addressed by the new Section 6.1, which pairs each feedback form with its optimization family and states the assumptions each pairing carries (page 9, within lines 651–706). Where the honest answer is that no formal result exists, the text says so and routes the question to the research agenda rather than gesturing at rigor the field does not yet have.</w:t>
+              <w:t xml:space="preserve">We agree. This comment is addressed by the new Section 6.1, which pairs each feedback form with its optimization family and states the assumptions each pairing carries (page 9, within lines 651–706). Where the honest answer is that no formal result exists, the text says so and routes the question to the research agenda (Section 6.5).</w:t>
             </w:r>
           </w:p>
         </w:tc>
@@ -1670,7 +1673,7 @@
               <w:pStyle w:val="Compact"/>
             </w:pPr>
             <w:r>
-              <w:t xml:space="preserve">We agree and have stated the modality scope explicitly: the feedback signal is natural-language text; observations may be non-textual (Section 1, page 2, lines 96–101). The genealogy note (page 2, lines 110–112) additionally records that we generalize Shinn et al.’s narrower coinage deliberately.</w:t>
+              <w:t xml:space="preserve">We agree and have stated the modality scope explicitly: the feedback signal is natural-language text; observations may be non-textual (Section 1, page 2, lines 99–104). The genealogy note (page 2, lines 110–112) additionally records that we generalize Shinn et al.’s narrower coinage deliberately.</w:t>
             </w:r>
           </w:p>
         </w:tc>
@@ -1722,6 +1725,45 @@
               <w:pStyle w:val="Compact"/>
             </w:pPr>
             <w:r>
+              <w:t xml:space="preserve">C3</w:t>
+            </w:r>
+          </w:p>
+        </w:tc>
+        <w:tc>
+          <w:tcPr/>
+          <w:p>
+            <w:pPr>
+              <w:pStyle w:val="Compact"/>
+            </w:pPr>
+            <w:r>
+              <w:rPr>
+                <w:i/>
+                <w:iCs/>
+              </w:rPr>
+              <w:t xml:space="preserve">The paper should also include a stronger algorithmic perspective. Different RL algorithms may benefit from language feedback in different ways, and it would be valuable to discuss which methods are appropriate under which conditions.</w:t>
+            </w:r>
+          </w:p>
+        </w:tc>
+        <w:tc>
+          <w:tcPr/>
+          <w:p>
+            <w:pPr>
+              <w:pStyle w:val="Compact"/>
+            </w:pPr>
+            <w:r>
+              <w:t xml:space="preserve">This comment is addressed together with W3: the new Section 6.1 maps each feedback form to its optimization family with the conditions under which each pairing is appropriate (page 9, within lines 651–706), and Appendix B, Table 4 (page 19) states the per-mechanism conditions and risks.</w:t>
+            </w:r>
+          </w:p>
+        </w:tc>
+      </w:tr>
+      <w:tr>
+        <w:tc>
+          <w:tcPr/>
+          <w:p>
+            <w:pPr>
+              <w:pStyle w:val="Compact"/>
+            </w:pPr>
+            <w:r>
               <w:t xml:space="preserve">C2</w:t>
             </w:r>
           </w:p>
@@ -1787,7 +1829,7 @@
               <w:pStyle w:val="Compact"/>
             </w:pPr>
             <w:r>
-              <w:t xml:space="preserve">Addressed identically to Reviewer 3gqM’s request: the expanded Limitations section names all four failure modes and their societal-impact consequences (page 10, lines 827–832).</w:t>
+              <w:t xml:space="preserve">Addressed identically to Reviewer 3gqM’s request: the expanded Limitations section names all four failure modes and their societal-impact consequences (page 10, lines 830–843).</w:t>
             </w:r>
           </w:p>
         </w:tc>

</xml_diff>

<commit_message>
Round 2 final: direct-replacement markup (no strikethrough), zero-warning builds, two-column appendix tables on one page, refreshed line numbers, responses PDF, Google Doc uploaded
</commit_message>
<xml_diff>
--- a/revision/Responses_to_Reviewers.docx
+++ b/revision/Responses_to_Reviewers.docx
@@ -58,7 +58,7 @@
         <w:t xml:space="preserve"> </w:t>
       </w:r>
       <w:r>
-        <w:t xml:space="preserve">in the revised manuscript (deletions appear in red strikethrough), and page and line numbers below refer to the</w:t>
+        <w:t xml:space="preserve">in the revised manuscript. Changes were made by direct replacement: superseded text was removed and the new or updated text appears in red. Page and line numbers below refer to the</w:t>
       </w:r>
       <w:r>
         <w:t xml:space="preserve"> </w:t>
@@ -228,7 +228,7 @@
               <w:pStyle w:val="Compact"/>
             </w:pPr>
             <w:r>
-              <w:t xml:space="preserve">We fully agree, and we apologize for the imprecision. This comment is addressed as follows: the broad definition is replaced by two explicit inclusion criteria, (i) the linguistic structure of the feedback must be functionally consumed rather than collapsed to a scalar or preference bit before use, and (ii) the feedback must participate in an improvement loop (Section 1, page 2, lines 76–95). The same passage now states what does</w:t>
+              <w:t xml:space="preserve">We fully agree, and we apologize for the imprecision. This comment is addressed as follows: the broad definition is replaced by two explicit inclusion criteria, (i) the linguistic structure of the feedback must be functionally consumed rather than collapsed to a scalar or preference bit before use, and (ii) the feedback must participate in an improvement loop (Section 1, page 2, lines 70–91). The same passage now states what does</w:t>
             </w:r>
             <w:r>
               <w:t xml:space="preserve"> </w:t>
@@ -244,7 +244,7 @@
               <w:t xml:space="preserve"> </w:t>
             </w:r>
             <w:r>
-              <w:t xml:space="preserve">count as VRL: plain instruction following (no improvement loop), vanilla RLHF/DPO (judgment reduced to a preference bit before learning; retained only as the scalar endpoint of the compression spectrum, see also Section 5.4, page 8, lines 637–641), and language-conditioned RL (language as policy input, not feedback). A boundary clarification for specification-time consumption appears at page 2, lines 95–99, and the abstract now announces the criteria (page 1, lines 8–11).</w:t>
+              <w:t xml:space="preserve">count as VRL: plain instruction following (no improvement loop), vanilla RLHF/DPO (judgment reduced to a preference bit before learning; retained only as the scalar endpoint of the compression spectrum, see also Section 5.4, page 8, lines 617–627), and language-conditioned RL (language as policy input, not feedback). A boundary clarification for specification-time consumption appears at page 2, lines 89–93, and the abstract now announces the criteria (page 1, lines 8–11).</w:t>
             </w:r>
           </w:p>
         </w:tc>
@@ -295,7 +295,7 @@
               <w:t xml:space="preserve"> </w:t>
             </w:r>
             <w:r>
-              <w:t xml:space="preserve">(page 4, lines 239–244), and a new hybrid-cases table (Table 1, page 4) records primary placements together with secondary roles instead of forcing single-cell membership. For the two cases the reviewer names: reward-code generation now carries the specification-time rationale and an explicit pointer to its downstream training role (Section 3.4, page 5, lines 379–384), and experiential memory is now classified by its moment of consumption with the cross-episode boundary recorded (Section 4.4, page 7, lines 481–486).</w:t>
+              <w:t xml:space="preserve">(page 3, lines 229–233), and a new hybrid-cases table (Table 1, page 4) records primary placements together with secondary roles instead of forcing single-cell membership. For the two cases the reviewer names: reward-code generation now carries the specification-time rationale and an explicit pointer to its downstream training role (Section 3.4, page 5, lines 368–372), and experiential memory is now classified by its moment of consumption with the cross-episode boundary recorded (Section 4.4, page 7, lines 467–472).</w:t>
             </w:r>
           </w:p>
         </w:tc>
@@ -446,7 +446,7 @@
               <w:pStyle w:val="Compact"/>
             </w:pPr>
             <w:r>
-              <w:t xml:space="preserve">We agree and thank the reviewer for the concrete framing. This comment is addressed in the expanded Limitations section (page 10, lines 830–843), which now names the failure modes (incorrect, biased, adversarial, or poorly grounded feedback) and discusses who is harmed in the high-stakes deployments the reviewer lists, complementing the existing Section 6 discussion of prompt injection, memory poisoning, and sycophancy.</w:t>
+              <w:t xml:space="preserve">We agree and thank the reviewer for the concrete framing. This comment is addressed in the expanded Limitations section (page 10, lines 813–831), which now names the failure modes (incorrect, biased, adversarial, or poorly grounded feedback) and discusses who is harmed in the high-stakes deployments the reviewer lists, complementing the existing Section 6 discussion of prompt injection, memory poisoning, and sycophancy.</w:t>
             </w:r>
           </w:p>
         </w:tc>
@@ -585,7 +585,7 @@
               <w:pStyle w:val="Compact"/>
             </w:pPr>
             <w:r>
-              <w:t xml:space="preserve">We agree, and we are sorry the original framing invited this reading. This comment is addressed as follows: the definition is replaced by two inclusion criteria (Section 1, page 2, lines 76–95) under which supervised fine-tuning on instructions and vanilla RLHF/DPO fall</w:t>
+              <w:t xml:space="preserve">We agree, and we are sorry the original framing invited this reading. This comment is addressed as follows: the definition is replaced by two inclusion criteria (Section 1, page 2, lines 70–91) under which supervised fine-tuning on instructions and vanilla RLHF/DPO fall</w:t>
             </w:r>
             <w:r>
               <w:t xml:space="preserve"> </w:t>
@@ -601,7 +601,7 @@
               <w:t xml:space="preserve"> </w:t>
             </w:r>
             <w:r>
-              <w:t xml:space="preserve">VRL; they are retained only as the scalar endpoint of the compression spectrum, stated explicitly where preference shaping is discussed (Section 5.4, page 8, lines 637–641). This materially narrows the scope and separates the survey from general LLM training and alignment.</w:t>
+              <w:t xml:space="preserve">VRL; they are retained only as the scalar endpoint of the compression spectrum, stated explicitly where preference shaping is discussed (Section 5.4, page 8, lines 617–627). This materially narrows the scope and separates the survey from general LLM training and alignment.</w:t>
             </w:r>
           </w:p>
         </w:tc>
@@ -640,7 +640,7 @@
               <w:pStyle w:val="Compact"/>
             </w:pPr>
             <w:r>
-              <w:t xml:space="preserve">We agree. This comment is addressed by an explicit genealogy statement: Section 1 now says that we deliberately generalize the term introduced by Shinn et al. (2023) for self-reflective agents, and states the generalization up front to avoid conflation with the original narrower sense (page 2, lines 110–112).</w:t>
+              <w:t xml:space="preserve">We agree. This comment is addressed by an explicit genealogy statement: Section 1 now says that we deliberately generalize the term introduced by Shinn et al. (2023) for self-reflective agents, and states the generalization up front to avoid conflation with the original narrower sense (page 2, lines 100–104).</w:t>
             </w:r>
           </w:p>
         </w:tc>
@@ -691,7 +691,7 @@
               <w:t xml:space="preserve"> </w:t>
             </w:r>
             <w:r>
-              <w:t xml:space="preserve">(Section 2, page 4, lines 256–260). The coding-agent example is reframed accordingly, as a system in which signals of all three kinds coexist.</w:t>
+              <w:t xml:space="preserve">(Section 2, page 4, lines 242–247). The coding-agent example is reframed accordingly, as a system in which signals of all three kinds coexist.</w:t>
             </w:r>
           </w:p>
         </w:tc>
@@ -769,7 +769,7 @@
               <w:pStyle w:val="Compact"/>
             </w:pPr>
             <w:r>
-              <w:t xml:space="preserve">We agree in part, and we have clarified our intent. This comment is addressed by an explicit caveat in Section 2: MDP vocabulary serves as an organizing lens rather than a claim that every method admits an MDP formulation; many settings are partially observable, non-Markovian, or lack explicit transition and reward functions (page 4, lines 246–252).</w:t>
+              <w:t xml:space="preserve">We agree in part, and we have clarified our intent. This comment is addressed by an explicit caveat in Section 2: MDP vocabulary serves as an organizing lens rather than a claim that every method admits an MDP formulation; many settings are partially observable, non-Markovian, or lack explicit transition and reward functions (pages 3–4, lines 235–241).</w:t>
             </w:r>
           </w:p>
         </w:tc>
@@ -820,7 +820,7 @@
               <w:t xml:space="preserve"> </w:t>
             </w:r>
             <w:r>
-              <w:t xml:space="preserve">and now opens with the inclusion criterion: the verbal evaluator signal consumed during search is what qualifies, not the search procedure itself, and decoding strategies with no linguistic feedback fall outside VRL (Section 4.5, page 7, lines 502–505).</w:t>
+              <w:t xml:space="preserve">and now opens with the inclusion criterion: the verbal evaluator signal consumed during search is what qualifies, not the search procedure itself, and decoding strategies with no linguistic feedback fall outside VRL (Section 4.5, page 7, lines 487–493).</w:t>
             </w:r>
           </w:p>
         </w:tc>
@@ -859,7 +859,7 @@
               <w:pStyle w:val="Compact"/>
             </w:pPr>
             <w:r>
-              <w:t xml:space="preserve">We agree. This comment is addressed in three places: (a) a new evaluation-practice discussion recommending that feedback quality and feedback utilization be reported separately, with the relevant benchmarks (Section 6.2, page 9, lines 692–697); (b) a new practitioner decision table stating when each verbal-feedback mechanism is the right choice (Appendix B, Table 4, page 19); and (c) a named research agenda (Section 6.5, page 10, lines 777–787). Constructing a new benchmark is beyond a survey’s scope, but we believe the comparison framework and decision guidance directly address the comparability gap.</w:t>
+              <w:t xml:space="preserve">We agree. This comment is addressed in three places: (a) a new evaluation-practice discussion recommending that feedback quality and feedback utilization be reported separately, with the relevant benchmarks (Section 6.2, page 9, lines 674–684); (b) a new practitioner decision table stating when each verbal-feedback mechanism is the right choice (Appendix B, Table 4, page 19); and (c) a named research agenda (Section 6.5, page 10, lines 758–773). Constructing a new benchmark is beyond a survey’s scope, but we believe the comparison framework and decision guidance directly address the comparability gap.</w:t>
             </w:r>
           </w:p>
         </w:tc>
@@ -965,7 +965,7 @@
               <w:pStyle w:val="Compact"/>
             </w:pPr>
             <w:r>
-              <w:t xml:space="preserve">Addressed together with W1 and W4: exclusions are now stated explicitly in Section 1 (page 2, lines 85–95), including instruction following, vanilla RLHF/DPO, and language-conditioned RL.</w:t>
+              <w:t xml:space="preserve">Addressed together with W1 and W4: exclusions are now stated explicitly in Section 1 (page 2, lines 79–91), including instruction following, vanilla RLHF/DPO, and language-conditioned RL.</w:t>
             </w:r>
           </w:p>
         </w:tc>
@@ -1104,7 +1104,7 @@
               <w:pStyle w:val="Compact"/>
             </w:pPr>
             <w:r>
-              <w:t xml:space="preserve">We agree, and we apologize for the omission. This comment is addressed as follows: the introduction now positions the survey against prior overviews with citations (Section 1, page 3, lines 146–165), and a new comparison table covers twelve surveys and frameworks with columns for organizing axis, feedback types, lifecycle stages, and practitioner guidance (Appendix A, Table 3, page 18). The accompanying text states our differentiation: prior surveys organize by mechanism or agent capability, ours by the signal itself.</w:t>
+              <w:t xml:space="preserve">We agree, and we apologize for the omission. This comment is addressed as follows: the introduction now positions the survey against prior overviews with citations (Section 1, page 3, lines 142–157), and a new comparison table covers twelve surveys and frameworks with columns for organizing axis, feedback types, lifecycle stages, and practitioner guidance (Appendix A, Table 3, page 19). The accompanying text states our differentiation: prior surveys organize by mechanism or agent capability, ours by the signal itself.</w:t>
             </w:r>
           </w:p>
         </w:tc>
@@ -1143,7 +1143,7 @@
               <w:pStyle w:val="Compact"/>
             </w:pPr>
             <w:r>
-              <w:t xml:space="preserve">This comment is addressed by making the taxonomy operational: an explicit assignment rule (Section 2, page 4, lines 239–244), a hybrid-cases table showing the rule applied (Table 1, page 4), and a new contribution bullet committing the paper to applicability rather than description (Section 1, page 3, within lines 188–236).</w:t>
+              <w:t xml:space="preserve">This comment is addressed by making the taxonomy operational: an explicit assignment rule (Section 2, page 3, lines 229–233), a hybrid-cases table showing the rule applied (Table 1, page 4), and a new contribution bullet committing the paper to applicability rather than description (Section 1, page 3, lines 177–180).</w:t>
             </w:r>
           </w:p>
         </w:tc>
@@ -1194,7 +1194,7 @@
               <w:t xml:space="preserve"> </w:t>
             </w:r>
             <w:r>
-              <w:t xml:space="preserve">(Section 6.1, page 9, within lines 651–706), and a new decision table keyed to properties a practitioner can assess in advance, task verifiability, feedback latency and cost, and risk exposure, with representative methods per row (Appendix B, Table 4, page 19).</w:t>
+              <w:t xml:space="preserve">(Section 6.1, pages 8–9, lines 630–661), and a new decision table keyed to properties a practitioner can assess in advance, task verifiability, feedback latency and cost, and risk exposure, with representative methods per row (Appendix B, Table 4, page 19).</w:t>
             </w:r>
           </w:p>
         </w:tc>
@@ -1233,7 +1233,7 @@
               <w:pStyle w:val="Compact"/>
             </w:pPr>
             <w:r>
-              <w:t xml:space="preserve">We agree and have deepened the treatment within the page budget. Section 6.1 now maps feedback forms to algorithm families (online policy gradients with generated rewards, offline preference objectives, supervised fine-tuning on filtered or conditioned text, and process reward models for step-level credit assignment) and discusses the MDP-level consequences the reviewer raises (page 9, within lines 651–706). Where formal results do not exist we say so explicitly, and the research agenda names credit assignment from free-form critiques as an open problem (Section 6.5, page 10).</w:t>
+              <w:t xml:space="preserve">We agree and have deepened the treatment within the page budget. Section 6.1 now maps feedback forms to algorithm families (online policy gradients with generated rewards, offline preference objectives, supervised fine-tuning on filtered or conditioned text, and process reward models for step-level credit assignment) and discusses the MDP-level consequences the reviewer raises (pages 8–9, lines 630–661). Where formal results do not exist we say so explicitly, and the research agenda names credit assignment from free-form critiques as an open problem (Section 6.5, page 10).</w:t>
             </w:r>
           </w:p>
         </w:tc>
@@ -1311,7 +1311,7 @@
               <w:pStyle w:val="Compact"/>
             </w:pPr>
             <w:r>
-              <w:t xml:space="preserve">Addressed together with W4: the new Section 6.1 discusses precisely these three consequence classes, mis-specification and hacking risks for language-specified rewards, information loss and aliasing for language-based state, and exploration effects for LLM-prior action generation (page 9), and the MDP-as-lens caveat clarifies the formal assumptions (Section 2, page 4, lines 244–249).</w:t>
+              <w:t xml:space="preserve">Addressed together with W4: the new Section 6.1 discusses precisely these three consequence classes, mis-specification and hacking risks for language-specified rewards, information loss and aliasing for language-based state, and exploration effects for LLM-prior action generation (page 9), and the MDP-as-lens caveat clarifies the formal assumptions (Section 2, pages 3–4, lines 235–241).</w:t>
             </w:r>
           </w:p>
         </w:tc>
@@ -1350,7 +1350,7 @@
               <w:pStyle w:val="Compact"/>
             </w:pPr>
             <w:r>
-              <w:t xml:space="preserve">We agree and have chosen to state the scope precisely: the feedback signal is natural-language text, while the agent’s observations may be non-textual, as in embodied settings (Section 1, page 2, lines 99–104). A fuller treatment of embodied and multimodal settings is planned for an extended version.</w:t>
+              <w:t xml:space="preserve">We agree and have chosen to state the scope precisely: the feedback signal is natural-language text, while the agent’s observations may be non-textual, as in embodied settings (Section 1, page 2, lines 92–97). A fuller treatment of embodied and multimodal settings is planned for an extended version.</w:t>
             </w:r>
           </w:p>
         </w:tc>
@@ -1389,7 +1389,7 @@
               <w:pStyle w:val="Compact"/>
             </w:pPr>
             <w:r>
-              <w:t xml:space="preserve">We thank the reviewer for the precise list. This comment is addressed in the expanded Limitations section, which now names all four failure modes verbatim and connects them to the mitigation discussions in Section 6 (page 10, lines 830–843).</w:t>
+              <w:t xml:space="preserve">We thank the reviewer for the precise list. This comment is addressed in the expanded Limitations section, which now names all four failure modes verbatim and connects them to the mitigation discussions in Section 6 (page 10, lines 813–831).</w:t>
             </w:r>
           </w:p>
         </w:tc>
@@ -1528,7 +1528,7 @@
               <w:pStyle w:val="Compact"/>
             </w:pPr>
             <w:r>
-              <w:t xml:space="preserve">We accept this criticism. This comment is addressed by stating four checkable contributions in the introduction: (i) explicit inclusion criteria for the paradigm, (ii) decision rules with a hybrid-cases table, (iii) a signal-centric organization distinguishing this survey from mechanism- and agent-centric overviews, and (iv) practitioner guidance plus a research agenda (Section 1, page 3, within lines 141–236). The comparison table (Appendix A, Table 3, page 18) makes the differentiation claim verifiable rather than asserted.</w:t>
+              <w:t xml:space="preserve">We accept this criticism. This comment is addressed by stating four checkable contributions in the introduction: (i) explicit inclusion criteria for the paradigm, (ii) decision rules with a hybrid-cases table, (iii) a signal-centric organization distinguishing this survey from mechanism- and agent-centric overviews, and (iv) practitioner guidance plus a research agenda (Section 1, page 3, lines 164–184). The comparison table (Appendix A, Table 3, page 19) makes the differentiation claim verifiable rather than asserted.</w:t>
             </w:r>
           </w:p>
         </w:tc>
@@ -1567,7 +1567,7 @@
               <w:pStyle w:val="Compact"/>
             </w:pPr>
             <w:r>
-              <w:t xml:space="preserve">We agree this was missing. This comment is addressed by (a) the research agenda in Section 6.5, which names five open problems, sample-efficiency conditions, optimality under language-shaped rewards, credit assignment from critiques, feedback provenance and robustness, and standardized evaluation (page 10, lines 777–787), and (b) the practitioner decision table, which turns the taxonomy into design guidance (Appendix B, Table 4, page 19).</w:t>
+              <w:t xml:space="preserve">We agree this was missing. This comment is addressed by (a) the research agenda in Section 6.5, which names five open problems, sample-efficiency conditions, optimality under language-shaped rewards, credit assignment from critiques, feedback provenance and robustness, and standardized evaluation (page 10, lines 758–773), and (b) the practitioner decision table, which turns the taxonomy into design guidance (Appendix B, Table 4, page 19).</w:t>
             </w:r>
           </w:p>
         </w:tc>
@@ -1606,7 +1606,7 @@
               <w:pStyle w:val="Compact"/>
             </w:pPr>
             <w:r>
-              <w:t xml:space="preserve">We agree. This comment is addressed by the new Section 6.1, which pairs each feedback form with its optimization family and states the assumptions each pairing carries (page 9, within lines 651–706). Where the honest answer is that no formal result exists, the text says so and routes the question to the research agenda (Section 6.5).</w:t>
+              <w:t xml:space="preserve">We agree. This comment is addressed by the new Section 6.1, which pairs each feedback form with its optimization family and states the assumptions each pairing carries (pages 8–9, lines 630–661). Where the honest answer is that no formal result exists, the text says so and routes the question to the research agenda (Section 6.5).</w:t>
             </w:r>
           </w:p>
         </w:tc>
@@ -1673,7 +1673,7 @@
               <w:pStyle w:val="Compact"/>
             </w:pPr>
             <w:r>
-              <w:t xml:space="preserve">We agree and have stated the modality scope explicitly: the feedback signal is natural-language text; observations may be non-textual (Section 1, page 2, lines 99–104). The genealogy note (page 2, lines 110–112) additionally records that we generalize Shinn et al.’s narrower coinage deliberately.</w:t>
+              <w:t xml:space="preserve">We agree and have stated the modality scope explicitly: the feedback signal is natural-language text; observations may be non-textual (Section 1, page 2, lines 92–97). The genealogy note (page 2, lines 100–104) additionally records that we generalize Shinn et al.’s narrower coinage deliberately.</w:t>
             </w:r>
           </w:p>
         </w:tc>
@@ -1725,6 +1725,45 @@
               <w:pStyle w:val="Compact"/>
             </w:pPr>
             <w:r>
+              <w:t xml:space="preserve">C2</w:t>
+            </w:r>
+          </w:p>
+        </w:tc>
+        <w:tc>
+          <w:tcPr/>
+          <w:p>
+            <w:pPr>
+              <w:pStyle w:val="Compact"/>
+            </w:pPr>
+            <w:r>
+              <w:rPr>
+                <w:i/>
+                <w:iCs/>
+              </w:rPr>
+              <w:t xml:space="preserve">I encourage the authors to develop a more rigorous framework for analyzing language in RL. For example, when language replaces or augments reward signals, discuss how this affects the underlying MDP formulation, policy optimality, and temporal credit assignment. Similarly, when language is used as state information, examine whether such representations preserve the assumptions needed for RL.</w:t>
+            </w:r>
+          </w:p>
+        </w:tc>
+        <w:tc>
+          <w:tcPr/>
+          <w:p>
+            <w:pPr>
+              <w:pStyle w:val="Compact"/>
+            </w:pPr>
+            <w:r>
+              <w:t xml:space="preserve">We thank the reviewer for this direction. Within the conference page budget, Section 6.1 now discusses the consequences of language inside the decision problem (reward mis-specification and hacking, state information loss and aliasing, exploration under LLM priors; page 9) and Section 6.5 names policy optimality and temporal credit assignment as open problems (page 10). We are honest that a full formal framework does not yet exist in the field; developing one is the first item of the stated agenda, and a comprehensive treatment is planned for an extended version.</w:t>
+            </w:r>
+          </w:p>
+        </w:tc>
+      </w:tr>
+      <w:tr>
+        <w:tc>
+          <w:tcPr/>
+          <w:p>
+            <w:pPr>
+              <w:pStyle w:val="Compact"/>
+            </w:pPr>
+            <w:r>
               <w:t xml:space="preserve">C3</w:t>
             </w:r>
           </w:p>
@@ -1751,46 +1790,7 @@
               <w:pStyle w:val="Compact"/>
             </w:pPr>
             <w:r>
-              <w:t xml:space="preserve">This comment is addressed together with W3: the new Section 6.1 maps each feedback form to its optimization family with the conditions under which each pairing is appropriate (page 9, within lines 651–706), and Appendix B, Table 4 (page 19) states the per-mechanism conditions and risks.</w:t>
-            </w:r>
-          </w:p>
-        </w:tc>
-      </w:tr>
-      <w:tr>
-        <w:tc>
-          <w:tcPr/>
-          <w:p>
-            <w:pPr>
-              <w:pStyle w:val="Compact"/>
-            </w:pPr>
-            <w:r>
-              <w:t xml:space="preserve">C2</w:t>
-            </w:r>
-          </w:p>
-        </w:tc>
-        <w:tc>
-          <w:tcPr/>
-          <w:p>
-            <w:pPr>
-              <w:pStyle w:val="Compact"/>
-            </w:pPr>
-            <w:r>
-              <w:rPr>
-                <w:i/>
-                <w:iCs/>
-              </w:rPr>
-              <w:t xml:space="preserve">I encourage the authors to develop a more rigorous framework for analyzing language in RL. For example, when language replaces or augments reward signals, discuss how this affects the underlying MDP formulation, policy optimality, and temporal credit assignment. Similarly, when language is used as state information, examine whether such representations preserve the assumptions needed for RL.</w:t>
-            </w:r>
-          </w:p>
-        </w:tc>
-        <w:tc>
-          <w:tcPr/>
-          <w:p>
-            <w:pPr>
-              <w:pStyle w:val="Compact"/>
-            </w:pPr>
-            <w:r>
-              <w:t xml:space="preserve">We thank the reviewer for this direction. Within the conference page budget, Section 6.1 now discusses the consequences of language inside the decision problem (reward mis-specification and hacking, state information loss and aliasing, exploration under LLM priors; page 9) and Section 6.5 names policy optimality and temporal credit assignment as open problems (page 10). We are honest that a full formal framework does not yet exist in the field; developing one is the first item of the stated agenda, and a comprehensive treatment is planned for an extended version.</w:t>
+              <w:t xml:space="preserve">This comment is addressed together with W3: the new Section 6.1 maps each feedback form to its optimization family with the conditions under which each pairing is appropriate (pages 8–9, lines 630–661), and Appendix B, Table 4 (page 19) states the per-mechanism conditions and risks.</w:t>
             </w:r>
           </w:p>
         </w:tc>
@@ -1829,7 +1829,7 @@
               <w:pStyle w:val="Compact"/>
             </w:pPr>
             <w:r>
-              <w:t xml:space="preserve">Addressed identically to Reviewer 3gqM’s request: the expanded Limitations section names all four failure modes and their societal-impact consequences (page 10, lines 830–843).</w:t>
+              <w:t xml:space="preserve">Addressed identically to Reviewer 3gqM’s request: the expanded Limitations section names all four failure modes and their societal-impact consequences (page 10, lines 813–831).</w:t>
             </w:r>
           </w:p>
         </w:tc>

</xml_diff>